<commit_message>
commit frontend connect with backend week 3
</commit_message>
<xml_diff>
--- a/Practice/Week_3/23640731_NguyenNamTrungNguyen_Tuan03.docx
+++ b/Practice/Week_3/23640731_NguyenNamTrungNguyen_Tuan03.docx
@@ -1,6 +1,6 @@
 
 <file path=word/document.xml><?xml version="1.0" encoding="utf-8"?>
-<w:document xmlns:wpc="http://schemas.microsoft.com/office/word/2010/wordprocessingCanvas" xmlns:cx="http://schemas.microsoft.com/office/drawing/2014/chartex" xmlns:cx1="http://schemas.microsoft.com/office/drawing/2015/9/8/chartex" xmlns:cx2="http://schemas.microsoft.com/office/drawing/2015/10/21/chartex" xmlns:cx3="http://schemas.microsoft.com/office/drawing/2016/5/9/chartex" xmlns:cx4="http://schemas.microsoft.com/office/drawing/2016/5/10/chartex" xmlns:cx5="http://schemas.microsoft.com/office/drawing/2016/5/11/chartex" xmlns:cx6="http://schemas.microsoft.com/office/drawing/2016/5/12/chartex" xmlns:cx7="http://schemas.microsoft.com/office/drawing/2016/5/13/chartex" xmlns:cx8="http://schemas.microsoft.com/office/drawing/2016/5/14/chartex" xmlns:mc="http://schemas.openxmlformats.org/markup-compatibility/2006" xmlns:aink="http://schemas.microsoft.com/office/drawing/2016/ink" xmlns:am3d="http://schemas.microsoft.com/office/drawing/2017/model3d" xmlns:o="urn:schemas-microsoft-com:office:office" xmlns:oel="http://schemas.microsoft.com/office/2019/extlst" xmlns:r="http://schemas.openxmlformats.org/officeDocument/2006/relationships" xmlns:m="http://schemas.openxmlformats.org/officeDocument/2006/math" xmlns:v="urn:schemas-microsoft-com:vml" xmlns:wp14="http://schemas.microsoft.com/office/word/2010/wordprocessingDrawing" xmlns:wp="http://schemas.openxmlformats.org/drawingml/2006/wordprocessingDrawing" xmlns:w10="urn:schemas-microsoft-com:office:word" xmlns:w="http://schemas.openxmlformats.org/wordprocessingml/2006/main" xmlns:w14="http://schemas.microsoft.com/office/word/2010/wordml" xmlns:w15="http://schemas.microsoft.com/office/word/2012/wordml" xmlns:w16cei="http://schemas.microsoft.com/office/word/2026/wordml/cei" xmlns:w16cex="http://schemas.microsoft.com/office/word/2018/wordml/cex" xmlns:w16cid="http://schemas.microsoft.com/office/word/2016/wordml/cid" xmlns:w16="http://schemas.microsoft.com/office/word/2018/wordml" xmlns:w16du="http://schemas.microsoft.com/office/word/2023/wordml/word16du" xmlns:w16sdtdh="http://schemas.microsoft.com/office/word/2020/wordml/sdtdatahash" xmlns:w16sdtfl="http://schemas.microsoft.com/office/word/2024/wordml/sdtformatlock" xmlns:w16se="http://schemas.microsoft.com/office/word/2015/wordml/symex" xmlns:wpg="http://schemas.microsoft.com/office/word/2010/wordprocessingGroup" xmlns:wpi="http://schemas.microsoft.com/office/word/2010/wordprocessingInk" xmlns:wne="http://schemas.microsoft.com/office/word/2006/wordml" xmlns:wps="http://schemas.microsoft.com/office/word/2010/wordprocessingShape" mc:Ignorable="w14 w15 w16se w16cid w16 w16cex w16sdtdh w16sdtfl w16du wp14">
+<w:document xmlns:wpc="http://schemas.microsoft.com/office/word/2010/wordprocessingCanvas" xmlns:cx="http://schemas.microsoft.com/office/drawing/2014/chartex" xmlns:cx1="http://schemas.microsoft.com/office/drawing/2015/9/8/chartex" xmlns:cx2="http://schemas.microsoft.com/office/drawing/2015/10/21/chartex" xmlns:cx3="http://schemas.microsoft.com/office/drawing/2016/5/9/chartex" xmlns:cx4="http://schemas.microsoft.com/office/drawing/2016/5/10/chartex" xmlns:cx5="http://schemas.microsoft.com/office/drawing/2016/5/11/chartex" xmlns:cx6="http://schemas.microsoft.com/office/drawing/2016/5/12/chartex" xmlns:cx7="http://schemas.microsoft.com/office/drawing/2016/5/13/chartex" xmlns:cx8="http://schemas.microsoft.com/office/drawing/2016/5/14/chartex" xmlns:mc="http://schemas.openxmlformats.org/markup-compatibility/2006" xmlns:aink="http://schemas.microsoft.com/office/drawing/2016/ink" xmlns:am3d="http://schemas.microsoft.com/office/drawing/2017/model3d" xmlns:o="urn:schemas-microsoft-com:office:office" xmlns:oel="http://schemas.microsoft.com/office/2019/extlst" xmlns:r="http://schemas.openxmlformats.org/officeDocument/2006/relationships" xmlns:m="http://schemas.openxmlformats.org/officeDocument/2006/math" xmlns:v="urn:schemas-microsoft-com:vml" xmlns:wp14="http://schemas.microsoft.com/office/word/2010/wordprocessingDrawing" xmlns:wp="http://schemas.openxmlformats.org/drawingml/2006/wordprocessingDrawing" xmlns:w10="urn:schemas-microsoft-com:office:word" xmlns:w="http://schemas.openxmlformats.org/wordprocessingml/2006/main" xmlns:w14="http://schemas.microsoft.com/office/word/2010/wordml" xmlns:w15="http://schemas.microsoft.com/office/word/2012/wordml" xmlns:w16cex="http://schemas.microsoft.com/office/word/2018/wordml/cex" xmlns:w16cid="http://schemas.microsoft.com/office/word/2016/wordml/cid" xmlns:w16="http://schemas.microsoft.com/office/word/2018/wordml" xmlns:w16du="http://schemas.microsoft.com/office/word/2023/wordml/word16du" xmlns:w16sdtdh="http://schemas.microsoft.com/office/word/2020/wordml/sdtdatahash" xmlns:w16se="http://schemas.microsoft.com/office/word/2015/wordml/symex" xmlns:wpg="http://schemas.microsoft.com/office/word/2010/wordprocessingGroup" xmlns:wpi="http://schemas.microsoft.com/office/word/2010/wordprocessingInk" xmlns:wne="http://schemas.microsoft.com/office/word/2006/wordml" xmlns:wps="http://schemas.microsoft.com/office/word/2010/wordprocessingShape" mc:Ignorable="w14 w15 w16se w16cid w16 w16cex w16sdtdh w16du wp14">
   <w:body>
     <w:p>
       <w:pPr>
@@ -11,7 +11,8 @@
           <w:b/>
           <w:bCs/>
           <w:kern w:val="36"/>
-          <w:szCs w:val="24"/>
+          <w:sz w:val="28"/>
+          <w:szCs w:val="28"/>
           <w14:ligatures w14:val="none"/>
         </w:rPr>
       </w:pPr>
@@ -19,8 +20,8 @@
         <w:rPr>
           <w:rFonts w:eastAsia="Calibri"/>
           <w:noProof/>
-          <w:sz w:val="32"/>
-          <w:szCs w:val="32"/>
+          <w:sz w:val="28"/>
+          <w:szCs w:val="28"/>
         </w:rPr>
         <mc:AlternateContent>
           <mc:Choice Requires="wpg">
@@ -4137,8 +4138,8 @@
       <w:r>
         <w:rPr>
           <w:noProof/>
-          <w:sz w:val="32"/>
-          <w:szCs w:val="32"/>
+          <w:sz w:val="28"/>
+          <w:szCs w:val="28"/>
         </w:rPr>
         <mc:AlternateContent>
           <mc:Choice Requires="wps">
@@ -4294,8 +4295,16 @@
       <w:pPr>
         <w:spacing w:after="160" w:line="259" w:lineRule="auto"/>
         <w:jc w:val="left"/>
+        <w:rPr>
+          <w:sz w:val="28"/>
+          <w:szCs w:val="28"/>
+        </w:rPr>
       </w:pPr>
       <w:r>
+        <w:rPr>
+          <w:sz w:val="28"/>
+          <w:szCs w:val="28"/>
+        </w:rPr>
         <w:br w:type="page"/>
       </w:r>
     </w:p>
@@ -4304,7 +4313,11 @@
         <w:spacing w:after="160" w:line="259" w:lineRule="auto"/>
         <w:jc w:val="left"/>
         <w:rPr>
+          <w:b/>
+          <w:bCs/>
           <w:noProof/>
+          <w:sz w:val="28"/>
+          <w:szCs w:val="28"/>
         </w:rPr>
       </w:pPr>
       <w:r>
@@ -4312,19 +4325,59 @@
           <w:b/>
           <w:bCs/>
           <w:noProof/>
+          <w:sz w:val="28"/>
+          <w:szCs w:val="28"/>
         </w:rPr>
         <w:lastRenderedPageBreak/>
+        <w:t xml:space="preserve">Link github: </w:t>
+      </w:r>
+      <w:hyperlink r:id="rId18" w:history="1">
+        <w:r>
+          <w:rPr>
+            <w:rStyle w:val="Hyperlink"/>
+            <w:b/>
+            <w:bCs/>
+            <w:noProof/>
+            <w:sz w:val="28"/>
+            <w:szCs w:val="28"/>
+          </w:rPr>
+          <w:t>https://github.com/nguyennamtrungnguyen/Learn-Java-World-Wide-Web/tree/main/Practice/Week_3</w:t>
+        </w:r>
+      </w:hyperlink>
+    </w:p>
+    <w:p>
+      <w:pPr>
+        <w:spacing w:after="160" w:line="259" w:lineRule="auto"/>
+        <w:jc w:val="left"/>
+        <w:rPr>
+          <w:noProof/>
+          <w:sz w:val="28"/>
+          <w:szCs w:val="28"/>
+        </w:rPr>
+      </w:pPr>
+      <w:r>
+        <w:rPr>
+          <w:b/>
+          <w:bCs/>
+          <w:noProof/>
+          <w:sz w:val="28"/>
+          <w:szCs w:val="28"/>
+        </w:rPr>
         <w:t>Bài 9: WebListener annotation.</w:t>
       </w:r>
       <w:r>
         <w:rPr>
           <w:noProof/>
+          <w:sz w:val="28"/>
+          <w:szCs w:val="28"/>
         </w:rPr>
         <w:t xml:space="preserve"> </w:t>
       </w:r>
       <w:r>
         <w:rPr>
           <w:noProof/>
+          <w:sz w:val="28"/>
+          <w:szCs w:val="28"/>
         </w:rPr>
         <w:drawing>
           <wp:inline distT="0" distB="0" distL="0" distR="0" wp14:anchorId="3C8081A1" wp14:editId="1830F712">
@@ -4342,7 +4395,7 @@
                     <pic:cNvPicPr/>
                   </pic:nvPicPr>
                   <pic:blipFill>
-                    <a:blip r:embed="rId18"/>
+                    <a:blip r:embed="rId19"/>
                     <a:stretch>
                       <a:fillRect/>
                     </a:stretch>
@@ -4369,6 +4422,8 @@
         <w:jc w:val="left"/>
         <w:rPr>
           <w:noProof/>
+          <w:sz w:val="28"/>
+          <w:szCs w:val="28"/>
         </w:rPr>
       </w:pPr>
     </w:p>
@@ -4378,11 +4433,15 @@
         <w:jc w:val="left"/>
         <w:rPr>
           <w:noProof/>
+          <w:sz w:val="28"/>
+          <w:szCs w:val="28"/>
         </w:rPr>
       </w:pPr>
       <w:r>
         <w:rPr>
           <w:noProof/>
+          <w:sz w:val="28"/>
+          <w:szCs w:val="28"/>
         </w:rPr>
         <w:br w:type="page"/>
       </w:r>
@@ -4395,6 +4454,8 @@
           <w:b/>
           <w:bCs/>
           <w:noProof/>
+          <w:sz w:val="28"/>
+          <w:szCs w:val="28"/>
         </w:rPr>
       </w:pPr>
       <w:r>
@@ -4402,6 +4463,8 @@
           <w:b/>
           <w:bCs/>
           <w:noProof/>
+          <w:sz w:val="28"/>
+          <w:szCs w:val="28"/>
         </w:rPr>
         <w:lastRenderedPageBreak/>
         <w:t>Bài 11: Jakarta EE – REST API</w:t>
@@ -4409,10 +4472,1362 @@
     </w:p>
     <w:p>
       <w:pPr>
+        <w:spacing w:after="160" w:line="259" w:lineRule="auto"/>
         <w:jc w:val="left"/>
         <w:rPr>
-          <w:sz w:val="36"/>
-          <w:szCs w:val="32"/>
+          <w:b/>
+          <w:bCs/>
+          <w:noProof/>
+          <w:sz w:val="28"/>
+          <w:szCs w:val="28"/>
+        </w:rPr>
+      </w:pPr>
+      <w:r>
+        <w:rPr>
+          <w:b/>
+          <w:bCs/>
+          <w:noProof/>
+          <w:sz w:val="28"/>
+          <w:szCs w:val="28"/>
+        </w:rPr>
+        <w:t>Test</w:t>
+      </w:r>
+      <w:r>
+        <w:rPr>
+          <w:b/>
+          <w:bCs/>
+          <w:noProof/>
+          <w:sz w:val="28"/>
+          <w:szCs w:val="28"/>
+        </w:rPr>
+        <w:t xml:space="preserve"> </w:t>
+      </w:r>
+      <w:r>
+        <w:rPr>
+          <w:b/>
+          <w:bCs/>
+          <w:noProof/>
+          <w:sz w:val="28"/>
+          <w:szCs w:val="28"/>
+        </w:rPr>
+        <w:t>method</w:t>
+      </w:r>
+      <w:r>
+        <w:rPr>
+          <w:b/>
+          <w:bCs/>
+          <w:noProof/>
+          <w:sz w:val="28"/>
+          <w:szCs w:val="28"/>
+        </w:rPr>
+        <w:t xml:space="preserve"> ViewUser</w:t>
+      </w:r>
+      <w:r>
+        <w:rPr>
+          <w:b/>
+          <w:bCs/>
+          <w:noProof/>
+          <w:sz w:val="28"/>
+          <w:szCs w:val="28"/>
+        </w:rPr>
+        <w:t>()</w:t>
+      </w:r>
+      <w:r>
+        <w:rPr>
+          <w:b/>
+          <w:bCs/>
+          <w:noProof/>
+          <w:sz w:val="28"/>
+          <w:szCs w:val="28"/>
+        </w:rPr>
+        <w:t xml:space="preserve"> trên web</w:t>
+      </w:r>
+    </w:p>
+    <w:p>
+      <w:pPr>
+        <w:jc w:val="left"/>
+        <w:rPr>
+          <w:sz w:val="28"/>
+          <w:szCs w:val="28"/>
+        </w:rPr>
+      </w:pPr>
+      <w:r>
+        <w:rPr>
+          <w:noProof/>
+          <w:sz w:val="28"/>
+          <w:szCs w:val="28"/>
+        </w:rPr>
+        <w:drawing>
+          <wp:inline distT="0" distB="0" distL="0" distR="0" wp14:anchorId="61DFFDD1" wp14:editId="3DF3F1AE">
+            <wp:extent cx="5760720" cy="3986530"/>
+            <wp:effectExtent l="0" t="0" r="0" b="0"/>
+            <wp:docPr id="928853740" name="Picture 1"/>
+            <wp:cNvGraphicFramePr>
+              <a:graphicFrameLocks xmlns:a="http://schemas.openxmlformats.org/drawingml/2006/main" noChangeAspect="1"/>
+            </wp:cNvGraphicFramePr>
+            <a:graphic xmlns:a="http://schemas.openxmlformats.org/drawingml/2006/main">
+              <a:graphicData uri="http://schemas.openxmlformats.org/drawingml/2006/picture">
+                <pic:pic xmlns:pic="http://schemas.openxmlformats.org/drawingml/2006/picture">
+                  <pic:nvPicPr>
+                    <pic:cNvPr id="928853740" name=""/>
+                    <pic:cNvPicPr/>
+                  </pic:nvPicPr>
+                  <pic:blipFill>
+                    <a:blip r:embed="rId20"/>
+                    <a:stretch>
+                      <a:fillRect/>
+                    </a:stretch>
+                  </pic:blipFill>
+                  <pic:spPr>
+                    <a:xfrm>
+                      <a:off x="0" y="0"/>
+                      <a:ext cx="5760720" cy="3986530"/>
+                    </a:xfrm>
+                    <a:prstGeom prst="rect">
+                      <a:avLst/>
+                    </a:prstGeom>
+                  </pic:spPr>
+                </pic:pic>
+              </a:graphicData>
+            </a:graphic>
+          </wp:inline>
+        </w:drawing>
+      </w:r>
+    </w:p>
+    <w:p>
+      <w:pPr>
+        <w:spacing w:after="160" w:line="259" w:lineRule="auto"/>
+        <w:jc w:val="left"/>
+        <w:rPr>
+          <w:b/>
+          <w:bCs/>
+          <w:noProof/>
+          <w:sz w:val="28"/>
+          <w:szCs w:val="28"/>
+        </w:rPr>
+      </w:pPr>
+      <w:r>
+        <w:rPr>
+          <w:b/>
+          <w:bCs/>
+          <w:noProof/>
+          <w:sz w:val="28"/>
+          <w:szCs w:val="28"/>
+        </w:rPr>
+        <w:t>Test method ViewUser() trên postman</w:t>
+      </w:r>
+      <w:r>
+        <w:rPr>
+          <w:noProof/>
+          <w:sz w:val="28"/>
+          <w:szCs w:val="28"/>
+        </w:rPr>
+        <w:drawing>
+          <wp:inline distT="0" distB="0" distL="0" distR="0" wp14:anchorId="3329F99F" wp14:editId="1D26A86D">
+            <wp:extent cx="5760720" cy="3944620"/>
+            <wp:effectExtent l="0" t="0" r="0" b="0"/>
+            <wp:docPr id="1800441150" name="Picture 1"/>
+            <wp:cNvGraphicFramePr>
+              <a:graphicFrameLocks xmlns:a="http://schemas.openxmlformats.org/drawingml/2006/main" noChangeAspect="1"/>
+            </wp:cNvGraphicFramePr>
+            <a:graphic xmlns:a="http://schemas.openxmlformats.org/drawingml/2006/main">
+              <a:graphicData uri="http://schemas.openxmlformats.org/drawingml/2006/picture">
+                <pic:pic xmlns:pic="http://schemas.openxmlformats.org/drawingml/2006/picture">
+                  <pic:nvPicPr>
+                    <pic:cNvPr id="1800441150" name=""/>
+                    <pic:cNvPicPr/>
+                  </pic:nvPicPr>
+                  <pic:blipFill>
+                    <a:blip r:embed="rId21"/>
+                    <a:stretch>
+                      <a:fillRect/>
+                    </a:stretch>
+                  </pic:blipFill>
+                  <pic:spPr>
+                    <a:xfrm>
+                      <a:off x="0" y="0"/>
+                      <a:ext cx="5760720" cy="3944620"/>
+                    </a:xfrm>
+                    <a:prstGeom prst="rect">
+                      <a:avLst/>
+                    </a:prstGeom>
+                  </pic:spPr>
+                </pic:pic>
+              </a:graphicData>
+            </a:graphic>
+          </wp:inline>
+        </w:drawing>
+      </w:r>
+    </w:p>
+    <w:p>
+      <w:pPr>
+        <w:spacing w:after="160" w:line="259" w:lineRule="auto"/>
+        <w:jc w:val="left"/>
+        <w:rPr>
+          <w:b/>
+          <w:bCs/>
+          <w:noProof/>
+          <w:sz w:val="28"/>
+          <w:szCs w:val="28"/>
+        </w:rPr>
+      </w:pPr>
+      <w:r>
+        <w:rPr>
+          <w:b/>
+          <w:bCs/>
+          <w:noProof/>
+          <w:sz w:val="28"/>
+          <w:szCs w:val="28"/>
+        </w:rPr>
+        <w:lastRenderedPageBreak/>
+        <w:t>Test method add() trên web</w:t>
+      </w:r>
+    </w:p>
+    <w:p>
+      <w:pPr>
+        <w:jc w:val="left"/>
+        <w:rPr>
+          <w:sz w:val="28"/>
+          <w:szCs w:val="28"/>
+        </w:rPr>
+      </w:pPr>
+      <w:r>
+        <w:rPr>
+          <w:noProof/>
+          <w:sz w:val="28"/>
+          <w:szCs w:val="28"/>
+        </w:rPr>
+        <w:drawing>
+          <wp:inline distT="0" distB="0" distL="0" distR="0" wp14:anchorId="1DA67C80" wp14:editId="557C3E89">
+            <wp:extent cx="5760720" cy="3970655"/>
+            <wp:effectExtent l="0" t="0" r="0" b="0"/>
+            <wp:docPr id="1941034954" name="Picture 1"/>
+            <wp:cNvGraphicFramePr>
+              <a:graphicFrameLocks xmlns:a="http://schemas.openxmlformats.org/drawingml/2006/main" noChangeAspect="1"/>
+            </wp:cNvGraphicFramePr>
+            <a:graphic xmlns:a="http://schemas.openxmlformats.org/drawingml/2006/main">
+              <a:graphicData uri="http://schemas.openxmlformats.org/drawingml/2006/picture">
+                <pic:pic xmlns:pic="http://schemas.openxmlformats.org/drawingml/2006/picture">
+                  <pic:nvPicPr>
+                    <pic:cNvPr id="1941034954" name=""/>
+                    <pic:cNvPicPr/>
+                  </pic:nvPicPr>
+                  <pic:blipFill>
+                    <a:blip r:embed="rId22"/>
+                    <a:stretch>
+                      <a:fillRect/>
+                    </a:stretch>
+                  </pic:blipFill>
+                  <pic:spPr>
+                    <a:xfrm>
+                      <a:off x="0" y="0"/>
+                      <a:ext cx="5760720" cy="3970655"/>
+                    </a:xfrm>
+                    <a:prstGeom prst="rect">
+                      <a:avLst/>
+                    </a:prstGeom>
+                  </pic:spPr>
+                </pic:pic>
+              </a:graphicData>
+            </a:graphic>
+          </wp:inline>
+        </w:drawing>
+      </w:r>
+    </w:p>
+    <w:p>
+      <w:pPr>
+        <w:jc w:val="left"/>
+        <w:rPr>
+          <w:sz w:val="28"/>
+          <w:szCs w:val="28"/>
+        </w:rPr>
+      </w:pPr>
+    </w:p>
+    <w:p>
+      <w:pPr>
+        <w:spacing w:after="160" w:line="259" w:lineRule="auto"/>
+        <w:jc w:val="left"/>
+        <w:rPr>
+          <w:b/>
+          <w:bCs/>
+          <w:noProof/>
+          <w:sz w:val="28"/>
+          <w:szCs w:val="28"/>
+        </w:rPr>
+      </w:pPr>
+      <w:r>
+        <w:rPr>
+          <w:b/>
+          <w:bCs/>
+          <w:noProof/>
+          <w:sz w:val="28"/>
+          <w:szCs w:val="28"/>
+        </w:rPr>
+        <w:t>Test method add() trên postman</w:t>
+      </w:r>
+    </w:p>
+    <w:p>
+      <w:pPr>
+        <w:jc w:val="left"/>
+        <w:rPr>
+          <w:sz w:val="28"/>
+          <w:szCs w:val="28"/>
+        </w:rPr>
+      </w:pPr>
+      <w:r>
+        <w:rPr>
+          <w:noProof/>
+          <w:sz w:val="28"/>
+          <w:szCs w:val="28"/>
+        </w:rPr>
+        <w:drawing>
+          <wp:inline distT="0" distB="0" distL="0" distR="0" wp14:anchorId="2CFCEF60" wp14:editId="756EA870">
+            <wp:extent cx="5760720" cy="3963035"/>
+            <wp:effectExtent l="0" t="0" r="0" b="0"/>
+            <wp:docPr id="792538355" name="Picture 1"/>
+            <wp:cNvGraphicFramePr>
+              <a:graphicFrameLocks xmlns:a="http://schemas.openxmlformats.org/drawingml/2006/main" noChangeAspect="1"/>
+            </wp:cNvGraphicFramePr>
+            <a:graphic xmlns:a="http://schemas.openxmlformats.org/drawingml/2006/main">
+              <a:graphicData uri="http://schemas.openxmlformats.org/drawingml/2006/picture">
+                <pic:pic xmlns:pic="http://schemas.openxmlformats.org/drawingml/2006/picture">
+                  <pic:nvPicPr>
+                    <pic:cNvPr id="792538355" name=""/>
+                    <pic:cNvPicPr/>
+                  </pic:nvPicPr>
+                  <pic:blipFill>
+                    <a:blip r:embed="rId23"/>
+                    <a:stretch>
+                      <a:fillRect/>
+                    </a:stretch>
+                  </pic:blipFill>
+                  <pic:spPr>
+                    <a:xfrm>
+                      <a:off x="0" y="0"/>
+                      <a:ext cx="5760720" cy="3963035"/>
+                    </a:xfrm>
+                    <a:prstGeom prst="rect">
+                      <a:avLst/>
+                    </a:prstGeom>
+                  </pic:spPr>
+                </pic:pic>
+              </a:graphicData>
+            </a:graphic>
+          </wp:inline>
+        </w:drawing>
+      </w:r>
+    </w:p>
+    <w:p>
+      <w:pPr>
+        <w:spacing w:after="160" w:line="259" w:lineRule="auto"/>
+        <w:jc w:val="left"/>
+        <w:rPr>
+          <w:b/>
+          <w:bCs/>
+          <w:noProof/>
+          <w:sz w:val="28"/>
+          <w:szCs w:val="28"/>
+        </w:rPr>
+      </w:pPr>
+      <w:r>
+        <w:rPr>
+          <w:b/>
+          <w:bCs/>
+          <w:noProof/>
+          <w:sz w:val="28"/>
+          <w:szCs w:val="28"/>
+        </w:rPr>
+        <w:lastRenderedPageBreak/>
+        <w:t>Test method getAllUsers() trên postman</w:t>
+      </w:r>
+    </w:p>
+    <w:p>
+      <w:pPr>
+        <w:spacing w:after="160" w:line="259" w:lineRule="auto"/>
+        <w:jc w:val="left"/>
+        <w:rPr>
+          <w:b/>
+          <w:bCs/>
+          <w:noProof/>
+          <w:sz w:val="28"/>
+          <w:szCs w:val="28"/>
+        </w:rPr>
+      </w:pPr>
+      <w:r>
+        <w:rPr>
+          <w:b/>
+          <w:bCs/>
+          <w:noProof/>
+          <w:sz w:val="28"/>
+          <w:szCs w:val="28"/>
+        </w:rPr>
+        <w:drawing>
+          <wp:inline distT="0" distB="0" distL="0" distR="0" wp14:anchorId="6BBA5DF7" wp14:editId="62E1448B">
+            <wp:extent cx="5760720" cy="3954145"/>
+            <wp:effectExtent l="0" t="0" r="0" b="8255"/>
+            <wp:docPr id="1607173912" name="Picture 1"/>
+            <wp:cNvGraphicFramePr>
+              <a:graphicFrameLocks xmlns:a="http://schemas.openxmlformats.org/drawingml/2006/main" noChangeAspect="1"/>
+            </wp:cNvGraphicFramePr>
+            <a:graphic xmlns:a="http://schemas.openxmlformats.org/drawingml/2006/main">
+              <a:graphicData uri="http://schemas.openxmlformats.org/drawingml/2006/picture">
+                <pic:pic xmlns:pic="http://schemas.openxmlformats.org/drawingml/2006/picture">
+                  <pic:nvPicPr>
+                    <pic:cNvPr id="1607173912" name=""/>
+                    <pic:cNvPicPr/>
+                  </pic:nvPicPr>
+                  <pic:blipFill>
+                    <a:blip r:embed="rId24"/>
+                    <a:stretch>
+                      <a:fillRect/>
+                    </a:stretch>
+                  </pic:blipFill>
+                  <pic:spPr>
+                    <a:xfrm>
+                      <a:off x="0" y="0"/>
+                      <a:ext cx="5760720" cy="3954145"/>
+                    </a:xfrm>
+                    <a:prstGeom prst="rect">
+                      <a:avLst/>
+                    </a:prstGeom>
+                  </pic:spPr>
+                </pic:pic>
+              </a:graphicData>
+            </a:graphic>
+          </wp:inline>
+        </w:drawing>
+      </w:r>
+    </w:p>
+    <w:p>
+      <w:pPr>
+        <w:spacing w:after="160" w:line="259" w:lineRule="auto"/>
+        <w:jc w:val="left"/>
+        <w:rPr>
+          <w:b/>
+          <w:bCs/>
+          <w:noProof/>
+          <w:sz w:val="28"/>
+          <w:szCs w:val="28"/>
+        </w:rPr>
+      </w:pPr>
+    </w:p>
+    <w:p>
+      <w:pPr>
+        <w:spacing w:after="160" w:line="259" w:lineRule="auto"/>
+        <w:jc w:val="left"/>
+        <w:rPr>
+          <w:b/>
+          <w:bCs/>
+          <w:noProof/>
+          <w:sz w:val="28"/>
+          <w:szCs w:val="28"/>
+        </w:rPr>
+      </w:pPr>
+      <w:r>
+        <w:rPr>
+          <w:b/>
+          <w:bCs/>
+          <w:noProof/>
+          <w:sz w:val="28"/>
+          <w:szCs w:val="28"/>
+        </w:rPr>
+        <w:t>Test method getUserById() trên postman</w:t>
+      </w:r>
+    </w:p>
+    <w:p>
+      <w:pPr>
+        <w:jc w:val="left"/>
+        <w:rPr>
+          <w:sz w:val="28"/>
+          <w:szCs w:val="28"/>
+        </w:rPr>
+      </w:pPr>
+      <w:r>
+        <w:rPr>
+          <w:noProof/>
+          <w:sz w:val="28"/>
+          <w:szCs w:val="28"/>
+        </w:rPr>
+        <w:drawing>
+          <wp:inline distT="0" distB="0" distL="0" distR="0" wp14:anchorId="0038121B" wp14:editId="3F5A79B4">
+            <wp:extent cx="5760720" cy="3956685"/>
+            <wp:effectExtent l="0" t="0" r="0" b="5715"/>
+            <wp:docPr id="1460352385" name="Picture 1"/>
+            <wp:cNvGraphicFramePr>
+              <a:graphicFrameLocks xmlns:a="http://schemas.openxmlformats.org/drawingml/2006/main" noChangeAspect="1"/>
+            </wp:cNvGraphicFramePr>
+            <a:graphic xmlns:a="http://schemas.openxmlformats.org/drawingml/2006/main">
+              <a:graphicData uri="http://schemas.openxmlformats.org/drawingml/2006/picture">
+                <pic:pic xmlns:pic="http://schemas.openxmlformats.org/drawingml/2006/picture">
+                  <pic:nvPicPr>
+                    <pic:cNvPr id="1460352385" name=""/>
+                    <pic:cNvPicPr/>
+                  </pic:nvPicPr>
+                  <pic:blipFill>
+                    <a:blip r:embed="rId25"/>
+                    <a:stretch>
+                      <a:fillRect/>
+                    </a:stretch>
+                  </pic:blipFill>
+                  <pic:spPr>
+                    <a:xfrm>
+                      <a:off x="0" y="0"/>
+                      <a:ext cx="5760720" cy="3956685"/>
+                    </a:xfrm>
+                    <a:prstGeom prst="rect">
+                      <a:avLst/>
+                    </a:prstGeom>
+                  </pic:spPr>
+                </pic:pic>
+              </a:graphicData>
+            </a:graphic>
+          </wp:inline>
+        </w:drawing>
+      </w:r>
+    </w:p>
+    <w:p>
+      <w:pPr>
+        <w:jc w:val="left"/>
+        <w:rPr>
+          <w:b/>
+          <w:bCs/>
+          <w:noProof/>
+          <w:sz w:val="28"/>
+          <w:szCs w:val="28"/>
+        </w:rPr>
+      </w:pPr>
+      <w:r>
+        <w:rPr>
+          <w:b/>
+          <w:bCs/>
+          <w:noProof/>
+          <w:sz w:val="28"/>
+          <w:szCs w:val="28"/>
+        </w:rPr>
+        <w:lastRenderedPageBreak/>
+        <w:t>Test method createUser() trên postman</w:t>
+      </w:r>
+    </w:p>
+    <w:p>
+      <w:pPr>
+        <w:jc w:val="left"/>
+        <w:rPr>
+          <w:sz w:val="28"/>
+          <w:szCs w:val="28"/>
+        </w:rPr>
+      </w:pPr>
+      <w:r>
+        <w:rPr>
+          <w:noProof/>
+          <w:sz w:val="28"/>
+          <w:szCs w:val="28"/>
+        </w:rPr>
+        <w:drawing>
+          <wp:inline distT="0" distB="0" distL="0" distR="0" wp14:anchorId="4B117C4D" wp14:editId="0A2D772A">
+            <wp:extent cx="5760720" cy="3973830"/>
+            <wp:effectExtent l="0" t="0" r="0" b="7620"/>
+            <wp:docPr id="939297957" name="Picture 1"/>
+            <wp:cNvGraphicFramePr>
+              <a:graphicFrameLocks xmlns:a="http://schemas.openxmlformats.org/drawingml/2006/main" noChangeAspect="1"/>
+            </wp:cNvGraphicFramePr>
+            <a:graphic xmlns:a="http://schemas.openxmlformats.org/drawingml/2006/main">
+              <a:graphicData uri="http://schemas.openxmlformats.org/drawingml/2006/picture">
+                <pic:pic xmlns:pic="http://schemas.openxmlformats.org/drawingml/2006/picture">
+                  <pic:nvPicPr>
+                    <pic:cNvPr id="939297957" name=""/>
+                    <pic:cNvPicPr/>
+                  </pic:nvPicPr>
+                  <pic:blipFill>
+                    <a:blip r:embed="rId26"/>
+                    <a:stretch>
+                      <a:fillRect/>
+                    </a:stretch>
+                  </pic:blipFill>
+                  <pic:spPr>
+                    <a:xfrm>
+                      <a:off x="0" y="0"/>
+                      <a:ext cx="5760720" cy="3973830"/>
+                    </a:xfrm>
+                    <a:prstGeom prst="rect">
+                      <a:avLst/>
+                    </a:prstGeom>
+                  </pic:spPr>
+                </pic:pic>
+              </a:graphicData>
+            </a:graphic>
+          </wp:inline>
+        </w:drawing>
+      </w:r>
+    </w:p>
+    <w:p>
+      <w:pPr>
+        <w:jc w:val="left"/>
+        <w:rPr>
+          <w:sz w:val="28"/>
+          <w:szCs w:val="28"/>
+        </w:rPr>
+      </w:pPr>
+    </w:p>
+    <w:p>
+      <w:pPr>
+        <w:jc w:val="left"/>
+        <w:rPr>
+          <w:b/>
+          <w:bCs/>
+          <w:noProof/>
+          <w:sz w:val="28"/>
+          <w:szCs w:val="28"/>
+        </w:rPr>
+      </w:pPr>
+      <w:r>
+        <w:rPr>
+          <w:b/>
+          <w:bCs/>
+          <w:noProof/>
+          <w:sz w:val="28"/>
+          <w:szCs w:val="28"/>
+        </w:rPr>
+        <w:t>Test method updateUser() trên postman</w:t>
+      </w:r>
+    </w:p>
+    <w:p>
+      <w:pPr>
+        <w:jc w:val="left"/>
+        <w:rPr>
+          <w:sz w:val="28"/>
+          <w:szCs w:val="28"/>
+        </w:rPr>
+      </w:pPr>
+      <w:r>
+        <w:rPr>
+          <w:noProof/>
+          <w:sz w:val="28"/>
+          <w:szCs w:val="28"/>
+        </w:rPr>
+        <w:drawing>
+          <wp:inline distT="0" distB="0" distL="0" distR="0" wp14:anchorId="4D9E5064" wp14:editId="50AC9C27">
+            <wp:extent cx="5760720" cy="3943350"/>
+            <wp:effectExtent l="0" t="0" r="0" b="0"/>
+            <wp:docPr id="2017262626" name="Picture 1"/>
+            <wp:cNvGraphicFramePr>
+              <a:graphicFrameLocks xmlns:a="http://schemas.openxmlformats.org/drawingml/2006/main" noChangeAspect="1"/>
+            </wp:cNvGraphicFramePr>
+            <a:graphic xmlns:a="http://schemas.openxmlformats.org/drawingml/2006/main">
+              <a:graphicData uri="http://schemas.openxmlformats.org/drawingml/2006/picture">
+                <pic:pic xmlns:pic="http://schemas.openxmlformats.org/drawingml/2006/picture">
+                  <pic:nvPicPr>
+                    <pic:cNvPr id="2017262626" name=""/>
+                    <pic:cNvPicPr/>
+                  </pic:nvPicPr>
+                  <pic:blipFill>
+                    <a:blip r:embed="rId27"/>
+                    <a:stretch>
+                      <a:fillRect/>
+                    </a:stretch>
+                  </pic:blipFill>
+                  <pic:spPr>
+                    <a:xfrm>
+                      <a:off x="0" y="0"/>
+                      <a:ext cx="5760720" cy="3943350"/>
+                    </a:xfrm>
+                    <a:prstGeom prst="rect">
+                      <a:avLst/>
+                    </a:prstGeom>
+                  </pic:spPr>
+                </pic:pic>
+              </a:graphicData>
+            </a:graphic>
+          </wp:inline>
+        </w:drawing>
+      </w:r>
+    </w:p>
+    <w:p>
+      <w:pPr>
+        <w:jc w:val="left"/>
+        <w:rPr>
+          <w:b/>
+          <w:bCs/>
+          <w:noProof/>
+          <w:sz w:val="28"/>
+          <w:szCs w:val="28"/>
+        </w:rPr>
+      </w:pPr>
+      <w:r>
+        <w:rPr>
+          <w:b/>
+          <w:bCs/>
+          <w:noProof/>
+          <w:sz w:val="28"/>
+          <w:szCs w:val="28"/>
+        </w:rPr>
+        <w:lastRenderedPageBreak/>
+        <w:t xml:space="preserve">Test method </w:t>
+      </w:r>
+      <w:r>
+        <w:rPr>
+          <w:b/>
+          <w:bCs/>
+          <w:noProof/>
+          <w:sz w:val="28"/>
+          <w:szCs w:val="28"/>
+        </w:rPr>
+        <w:t>delete</w:t>
+      </w:r>
+      <w:r>
+        <w:rPr>
+          <w:b/>
+          <w:bCs/>
+          <w:noProof/>
+          <w:sz w:val="28"/>
+          <w:szCs w:val="28"/>
+        </w:rPr>
+        <w:t>User() trên postman</w:t>
+      </w:r>
+    </w:p>
+    <w:p>
+      <w:pPr>
+        <w:jc w:val="left"/>
+        <w:rPr>
+          <w:b/>
+          <w:bCs/>
+          <w:noProof/>
+          <w:sz w:val="28"/>
+          <w:szCs w:val="28"/>
+        </w:rPr>
+      </w:pPr>
+      <w:r>
+        <w:rPr>
+          <w:b/>
+          <w:bCs/>
+          <w:noProof/>
+          <w:sz w:val="28"/>
+          <w:szCs w:val="28"/>
+        </w:rPr>
+        <w:drawing>
+          <wp:inline distT="0" distB="0" distL="0" distR="0" wp14:anchorId="613BA932" wp14:editId="60BD1BC1">
+            <wp:extent cx="5760720" cy="3950970"/>
+            <wp:effectExtent l="0" t="0" r="0" b="0"/>
+            <wp:docPr id="542094702" name="Picture 1"/>
+            <wp:cNvGraphicFramePr>
+              <a:graphicFrameLocks xmlns:a="http://schemas.openxmlformats.org/drawingml/2006/main" noChangeAspect="1"/>
+            </wp:cNvGraphicFramePr>
+            <a:graphic xmlns:a="http://schemas.openxmlformats.org/drawingml/2006/main">
+              <a:graphicData uri="http://schemas.openxmlformats.org/drawingml/2006/picture">
+                <pic:pic xmlns:pic="http://schemas.openxmlformats.org/drawingml/2006/picture">
+                  <pic:nvPicPr>
+                    <pic:cNvPr id="542094702" name=""/>
+                    <pic:cNvPicPr/>
+                  </pic:nvPicPr>
+                  <pic:blipFill>
+                    <a:blip r:embed="rId28"/>
+                    <a:stretch>
+                      <a:fillRect/>
+                    </a:stretch>
+                  </pic:blipFill>
+                  <pic:spPr>
+                    <a:xfrm>
+                      <a:off x="0" y="0"/>
+                      <a:ext cx="5760720" cy="3950970"/>
+                    </a:xfrm>
+                    <a:prstGeom prst="rect">
+                      <a:avLst/>
+                    </a:prstGeom>
+                  </pic:spPr>
+                </pic:pic>
+              </a:graphicData>
+            </a:graphic>
+          </wp:inline>
+        </w:drawing>
+      </w:r>
+    </w:p>
+    <w:p>
+      <w:pPr>
+        <w:jc w:val="left"/>
+        <w:rPr>
+          <w:b/>
+          <w:bCs/>
+          <w:sz w:val="28"/>
+          <w:szCs w:val="28"/>
+        </w:rPr>
+      </w:pPr>
+      <w:r>
+        <w:rPr>
+          <w:b/>
+          <w:bCs/>
+          <w:sz w:val="28"/>
+          <w:szCs w:val="28"/>
+        </w:rPr>
+        <w:t xml:space="preserve">Frontend: ReactJS + Tailwind </w:t>
+      </w:r>
+    </w:p>
+    <w:p>
+      <w:pPr>
+        <w:jc w:val="left"/>
+        <w:rPr>
+          <w:b/>
+          <w:bCs/>
+          <w:sz w:val="28"/>
+          <w:szCs w:val="28"/>
+        </w:rPr>
+      </w:pPr>
+      <w:r>
+        <w:rPr>
+          <w:b/>
+          <w:bCs/>
+          <w:sz w:val="28"/>
+          <w:szCs w:val="28"/>
+        </w:rPr>
+        <w:t>Test method ViewUser() và method add()</w:t>
+      </w:r>
+      <w:r>
+        <w:rPr>
+          <w:b/>
+          <w:bCs/>
+          <w:sz w:val="28"/>
+          <w:szCs w:val="28"/>
+        </w:rPr>
+        <w:t xml:space="preserve"> trên giao diện</w:t>
+      </w:r>
+    </w:p>
+    <w:p>
+      <w:pPr>
+        <w:jc w:val="left"/>
+        <w:rPr>
+          <w:b/>
+          <w:bCs/>
+          <w:sz w:val="28"/>
+          <w:szCs w:val="28"/>
+        </w:rPr>
+      </w:pPr>
+      <w:r>
+        <w:rPr>
+          <w:b/>
+          <w:bCs/>
+          <w:sz w:val="28"/>
+          <w:szCs w:val="28"/>
+        </w:rPr>
+        <w:drawing>
+          <wp:inline distT="0" distB="0" distL="0" distR="0" wp14:anchorId="457E7B22" wp14:editId="2046AF48">
+            <wp:extent cx="5599990" cy="3908018"/>
+            <wp:effectExtent l="0" t="0" r="1270" b="0"/>
+            <wp:docPr id="1622370642" name="Picture 1"/>
+            <wp:cNvGraphicFramePr>
+              <a:graphicFrameLocks xmlns:a="http://schemas.openxmlformats.org/drawingml/2006/main" noChangeAspect="1"/>
+            </wp:cNvGraphicFramePr>
+            <a:graphic xmlns:a="http://schemas.openxmlformats.org/drawingml/2006/main">
+              <a:graphicData uri="http://schemas.openxmlformats.org/drawingml/2006/picture">
+                <pic:pic xmlns:pic="http://schemas.openxmlformats.org/drawingml/2006/picture">
+                  <pic:nvPicPr>
+                    <pic:cNvPr id="1622370642" name=""/>
+                    <pic:cNvPicPr/>
+                  </pic:nvPicPr>
+                  <pic:blipFill>
+                    <a:blip r:embed="rId29"/>
+                    <a:stretch>
+                      <a:fillRect/>
+                    </a:stretch>
+                  </pic:blipFill>
+                  <pic:spPr>
+                    <a:xfrm>
+                      <a:off x="0" y="0"/>
+                      <a:ext cx="5599990" cy="3908018"/>
+                    </a:xfrm>
+                    <a:prstGeom prst="rect">
+                      <a:avLst/>
+                    </a:prstGeom>
+                  </pic:spPr>
+                </pic:pic>
+              </a:graphicData>
+            </a:graphic>
+          </wp:inline>
+        </w:drawing>
+      </w:r>
+    </w:p>
+    <w:p>
+      <w:pPr>
+        <w:jc w:val="left"/>
+        <w:rPr>
+          <w:b/>
+          <w:bCs/>
+          <w:sz w:val="28"/>
+          <w:szCs w:val="28"/>
+        </w:rPr>
+      </w:pPr>
+      <w:r>
+        <w:rPr>
+          <w:b/>
+          <w:bCs/>
+          <w:sz w:val="28"/>
+          <w:szCs w:val="28"/>
+        </w:rPr>
+        <w:lastRenderedPageBreak/>
+        <w:t>Test getAllUser()</w:t>
+      </w:r>
+      <w:r>
+        <w:rPr>
+          <w:b/>
+          <w:bCs/>
+          <w:sz w:val="28"/>
+          <w:szCs w:val="28"/>
+        </w:rPr>
+        <w:t xml:space="preserve"> trên giao diện</w:t>
+      </w:r>
+    </w:p>
+    <w:p>
+      <w:pPr>
+        <w:jc w:val="left"/>
+        <w:rPr>
+          <w:sz w:val="28"/>
+          <w:szCs w:val="28"/>
+        </w:rPr>
+      </w:pPr>
+      <w:r>
+        <w:rPr>
+          <w:sz w:val="28"/>
+          <w:szCs w:val="28"/>
+        </w:rPr>
+        <w:drawing>
+          <wp:inline distT="0" distB="0" distL="0" distR="0" wp14:anchorId="57369023" wp14:editId="6A5CD88C">
+            <wp:extent cx="5766573" cy="4049485"/>
+            <wp:effectExtent l="0" t="0" r="5715" b="8255"/>
+            <wp:docPr id="761409505" name="Picture 1"/>
+            <wp:cNvGraphicFramePr>
+              <a:graphicFrameLocks xmlns:a="http://schemas.openxmlformats.org/drawingml/2006/main" noChangeAspect="1"/>
+            </wp:cNvGraphicFramePr>
+            <a:graphic xmlns:a="http://schemas.openxmlformats.org/drawingml/2006/main">
+              <a:graphicData uri="http://schemas.openxmlformats.org/drawingml/2006/picture">
+                <pic:pic xmlns:pic="http://schemas.openxmlformats.org/drawingml/2006/picture">
+                  <pic:nvPicPr>
+                    <pic:cNvPr id="761409505" name=""/>
+                    <pic:cNvPicPr/>
+                  </pic:nvPicPr>
+                  <pic:blipFill>
+                    <a:blip r:embed="rId30"/>
+                    <a:stretch>
+                      <a:fillRect/>
+                    </a:stretch>
+                  </pic:blipFill>
+                  <pic:spPr>
+                    <a:xfrm>
+                      <a:off x="0" y="0"/>
+                      <a:ext cx="5766573" cy="4049485"/>
+                    </a:xfrm>
+                    <a:prstGeom prst="rect">
+                      <a:avLst/>
+                    </a:prstGeom>
+                  </pic:spPr>
+                </pic:pic>
+              </a:graphicData>
+            </a:graphic>
+          </wp:inline>
+        </w:drawing>
+      </w:r>
+    </w:p>
+    <w:p>
+      <w:pPr>
+        <w:jc w:val="left"/>
+        <w:rPr>
+          <w:b/>
+          <w:bCs/>
+          <w:sz w:val="28"/>
+          <w:szCs w:val="28"/>
+        </w:rPr>
+      </w:pPr>
+      <w:r>
+        <w:rPr>
+          <w:b/>
+          <w:bCs/>
+          <w:sz w:val="28"/>
+          <w:szCs w:val="28"/>
+        </w:rPr>
+        <w:t xml:space="preserve">Test method </w:t>
+      </w:r>
+      <w:r>
+        <w:rPr>
+          <w:b/>
+          <w:bCs/>
+          <w:sz w:val="28"/>
+          <w:szCs w:val="28"/>
+        </w:rPr>
+        <w:t>getUserById trên giao diện</w:t>
+      </w:r>
+    </w:p>
+    <w:p>
+      <w:pPr>
+        <w:jc w:val="left"/>
+        <w:rPr>
+          <w:b/>
+          <w:bCs/>
+          <w:sz w:val="28"/>
+          <w:szCs w:val="28"/>
+        </w:rPr>
+      </w:pPr>
+      <w:r>
+        <w:rPr>
+          <w:b/>
+          <w:bCs/>
+          <w:sz w:val="28"/>
+          <w:szCs w:val="28"/>
+        </w:rPr>
+        <w:drawing>
+          <wp:inline distT="0" distB="0" distL="0" distR="0" wp14:anchorId="6A87F42E" wp14:editId="4560893E">
+            <wp:extent cx="5760720" cy="3094990"/>
+            <wp:effectExtent l="0" t="0" r="0" b="0"/>
+            <wp:docPr id="1863129806" name="Picture 1"/>
+            <wp:cNvGraphicFramePr>
+              <a:graphicFrameLocks xmlns:a="http://schemas.openxmlformats.org/drawingml/2006/main" noChangeAspect="1"/>
+            </wp:cNvGraphicFramePr>
+            <a:graphic xmlns:a="http://schemas.openxmlformats.org/drawingml/2006/main">
+              <a:graphicData uri="http://schemas.openxmlformats.org/drawingml/2006/picture">
+                <pic:pic xmlns:pic="http://schemas.openxmlformats.org/drawingml/2006/picture">
+                  <pic:nvPicPr>
+                    <pic:cNvPr id="1863129806" name=""/>
+                    <pic:cNvPicPr/>
+                  </pic:nvPicPr>
+                  <pic:blipFill>
+                    <a:blip r:embed="rId31"/>
+                    <a:stretch>
+                      <a:fillRect/>
+                    </a:stretch>
+                  </pic:blipFill>
+                  <pic:spPr>
+                    <a:xfrm>
+                      <a:off x="0" y="0"/>
+                      <a:ext cx="5760720" cy="3094990"/>
+                    </a:xfrm>
+                    <a:prstGeom prst="rect">
+                      <a:avLst/>
+                    </a:prstGeom>
+                  </pic:spPr>
+                </pic:pic>
+              </a:graphicData>
+            </a:graphic>
+          </wp:inline>
+        </w:drawing>
+      </w:r>
+    </w:p>
+    <w:p>
+      <w:pPr>
+        <w:jc w:val="left"/>
+        <w:rPr>
+          <w:b/>
+          <w:bCs/>
+          <w:sz w:val="28"/>
+          <w:szCs w:val="28"/>
+        </w:rPr>
+      </w:pPr>
+    </w:p>
+    <w:p>
+      <w:pPr>
+        <w:jc w:val="left"/>
+        <w:rPr>
+          <w:b/>
+          <w:bCs/>
+          <w:sz w:val="28"/>
+          <w:szCs w:val="28"/>
+        </w:rPr>
+      </w:pPr>
+    </w:p>
+    <w:p>
+      <w:pPr>
+        <w:jc w:val="left"/>
+        <w:rPr>
+          <w:b/>
+          <w:bCs/>
+          <w:sz w:val="28"/>
+          <w:szCs w:val="28"/>
+        </w:rPr>
+      </w:pPr>
+    </w:p>
+    <w:p>
+      <w:pPr>
+        <w:jc w:val="left"/>
+        <w:rPr>
+          <w:b/>
+          <w:bCs/>
+          <w:sz w:val="28"/>
+          <w:szCs w:val="28"/>
+        </w:rPr>
+      </w:pPr>
+      <w:r>
+        <w:rPr>
+          <w:b/>
+          <w:bCs/>
+          <w:sz w:val="28"/>
+          <w:szCs w:val="28"/>
+        </w:rPr>
+        <w:lastRenderedPageBreak/>
+        <w:t xml:space="preserve">Test method </w:t>
+      </w:r>
+      <w:r>
+        <w:rPr>
+          <w:b/>
+          <w:bCs/>
+          <w:sz w:val="28"/>
+          <w:szCs w:val="28"/>
+        </w:rPr>
+        <w:t>createUser()</w:t>
+      </w:r>
+      <w:r>
+        <w:rPr>
+          <w:b/>
+          <w:bCs/>
+          <w:sz w:val="28"/>
+          <w:szCs w:val="28"/>
+        </w:rPr>
+        <w:t xml:space="preserve"> trên giao diện</w:t>
+      </w:r>
+    </w:p>
+    <w:p>
+      <w:pPr>
+        <w:jc w:val="left"/>
+        <w:rPr>
+          <w:b/>
+          <w:bCs/>
+          <w:sz w:val="28"/>
+          <w:szCs w:val="28"/>
+        </w:rPr>
+      </w:pPr>
+      <w:r>
+        <w:rPr>
+          <w:b/>
+          <w:bCs/>
+          <w:sz w:val="28"/>
+          <w:szCs w:val="28"/>
+        </w:rPr>
+        <w:drawing>
+          <wp:inline distT="0" distB="0" distL="0" distR="0" wp14:anchorId="66E2135C" wp14:editId="5E70E025">
+            <wp:extent cx="5704609" cy="3797300"/>
+            <wp:effectExtent l="0" t="0" r="0" b="0"/>
+            <wp:docPr id="358724125" name="Picture 1"/>
+            <wp:cNvGraphicFramePr>
+              <a:graphicFrameLocks xmlns:a="http://schemas.openxmlformats.org/drawingml/2006/main" noChangeAspect="1"/>
+            </wp:cNvGraphicFramePr>
+            <a:graphic xmlns:a="http://schemas.openxmlformats.org/drawingml/2006/main">
+              <a:graphicData uri="http://schemas.openxmlformats.org/drawingml/2006/picture">
+                <pic:pic xmlns:pic="http://schemas.openxmlformats.org/drawingml/2006/picture">
+                  <pic:nvPicPr>
+                    <pic:cNvPr id="358724125" name=""/>
+                    <pic:cNvPicPr/>
+                  </pic:nvPicPr>
+                  <pic:blipFill>
+                    <a:blip r:embed="rId32"/>
+                    <a:stretch>
+                      <a:fillRect/>
+                    </a:stretch>
+                  </pic:blipFill>
+                  <pic:spPr>
+                    <a:xfrm>
+                      <a:off x="0" y="0"/>
+                      <a:ext cx="5705652" cy="3797994"/>
+                    </a:xfrm>
+                    <a:prstGeom prst="rect">
+                      <a:avLst/>
+                    </a:prstGeom>
+                  </pic:spPr>
+                </pic:pic>
+              </a:graphicData>
+            </a:graphic>
+          </wp:inline>
+        </w:drawing>
+      </w:r>
+    </w:p>
+    <w:p>
+      <w:pPr>
+        <w:jc w:val="left"/>
+        <w:rPr>
+          <w:b/>
+          <w:bCs/>
+          <w:sz w:val="28"/>
+          <w:szCs w:val="28"/>
+        </w:rPr>
+      </w:pPr>
+      <w:r>
+        <w:rPr>
+          <w:b/>
+          <w:bCs/>
+          <w:sz w:val="28"/>
+          <w:szCs w:val="28"/>
+        </w:rPr>
+        <w:t xml:space="preserve">Test method </w:t>
+      </w:r>
+      <w:r>
+        <w:rPr>
+          <w:b/>
+          <w:bCs/>
+          <w:sz w:val="28"/>
+          <w:szCs w:val="28"/>
+        </w:rPr>
+        <w:t>update</w:t>
+      </w:r>
+      <w:r>
+        <w:rPr>
+          <w:b/>
+          <w:bCs/>
+          <w:sz w:val="28"/>
+          <w:szCs w:val="28"/>
+        </w:rPr>
+        <w:t>User() trên giao diện</w:t>
+      </w:r>
+    </w:p>
+    <w:p>
+      <w:pPr>
+        <w:jc w:val="left"/>
+        <w:rPr>
+          <w:b/>
+          <w:bCs/>
+          <w:sz w:val="28"/>
+          <w:szCs w:val="28"/>
+        </w:rPr>
+      </w:pPr>
+      <w:r>
+        <w:rPr>
+          <w:b/>
+          <w:bCs/>
+          <w:sz w:val="28"/>
+          <w:szCs w:val="28"/>
+        </w:rPr>
+        <w:drawing>
+          <wp:inline distT="0" distB="0" distL="0" distR="0" wp14:anchorId="07479CD0" wp14:editId="686D722A">
+            <wp:extent cx="5689022" cy="4590415"/>
+            <wp:effectExtent l="0" t="0" r="6985" b="635"/>
+            <wp:docPr id="792716931" name="Picture 1"/>
+            <wp:cNvGraphicFramePr>
+              <a:graphicFrameLocks xmlns:a="http://schemas.openxmlformats.org/drawingml/2006/main" noChangeAspect="1"/>
+            </wp:cNvGraphicFramePr>
+            <a:graphic xmlns:a="http://schemas.openxmlformats.org/drawingml/2006/main">
+              <a:graphicData uri="http://schemas.openxmlformats.org/drawingml/2006/picture">
+                <pic:pic xmlns:pic="http://schemas.openxmlformats.org/drawingml/2006/picture">
+                  <pic:nvPicPr>
+                    <pic:cNvPr id="792716931" name=""/>
+                    <pic:cNvPicPr/>
+                  </pic:nvPicPr>
+                  <pic:blipFill>
+                    <a:blip r:embed="rId33"/>
+                    <a:stretch>
+                      <a:fillRect/>
+                    </a:stretch>
+                  </pic:blipFill>
+                  <pic:spPr>
+                    <a:xfrm>
+                      <a:off x="0" y="0"/>
+                      <a:ext cx="5691470" cy="4592390"/>
+                    </a:xfrm>
+                    <a:prstGeom prst="rect">
+                      <a:avLst/>
+                    </a:prstGeom>
+                  </pic:spPr>
+                </pic:pic>
+              </a:graphicData>
+            </a:graphic>
+          </wp:inline>
+        </w:drawing>
+      </w:r>
+    </w:p>
+    <w:p>
+      <w:pPr>
+        <w:jc w:val="left"/>
+        <w:rPr>
+          <w:b/>
+          <w:bCs/>
+          <w:sz w:val="28"/>
+          <w:szCs w:val="28"/>
+        </w:rPr>
+      </w:pPr>
+      <w:r>
+        <w:rPr>
+          <w:b/>
+          <w:bCs/>
+          <w:sz w:val="28"/>
+          <w:szCs w:val="28"/>
+        </w:rPr>
+        <w:lastRenderedPageBreak/>
+        <w:t xml:space="preserve">Test </w:t>
+      </w:r>
+      <w:r>
+        <w:rPr>
+          <w:b/>
+          <w:bCs/>
+          <w:sz w:val="28"/>
+          <w:szCs w:val="28"/>
+        </w:rPr>
+        <w:t>deleteUser</w:t>
+      </w:r>
+      <w:r>
+        <w:rPr>
+          <w:b/>
+          <w:bCs/>
+          <w:sz w:val="28"/>
+          <w:szCs w:val="28"/>
+        </w:rPr>
+        <w:t>()</w:t>
+      </w:r>
+      <w:r>
+        <w:rPr>
+          <w:b/>
+          <w:bCs/>
+          <w:sz w:val="28"/>
+          <w:szCs w:val="28"/>
+        </w:rPr>
+        <w:t xml:space="preserve"> trên giao diện</w:t>
+      </w:r>
+    </w:p>
+    <w:p>
+      <w:pPr>
+        <w:jc w:val="left"/>
+        <w:rPr>
+          <w:sz w:val="28"/>
+          <w:szCs w:val="28"/>
+        </w:rPr>
+      </w:pPr>
+      <w:r>
+        <w:rPr>
+          <w:sz w:val="28"/>
+          <w:szCs w:val="28"/>
+        </w:rPr>
+        <w:drawing>
+          <wp:inline distT="0" distB="0" distL="0" distR="0" wp14:anchorId="3C01C17C" wp14:editId="69933468">
+            <wp:extent cx="5617028" cy="4514732"/>
+            <wp:effectExtent l="0" t="0" r="3175" b="635"/>
+            <wp:docPr id="1919488689" name="Picture 1"/>
+            <wp:cNvGraphicFramePr>
+              <a:graphicFrameLocks xmlns:a="http://schemas.openxmlformats.org/drawingml/2006/main" noChangeAspect="1"/>
+            </wp:cNvGraphicFramePr>
+            <a:graphic xmlns:a="http://schemas.openxmlformats.org/drawingml/2006/main">
+              <a:graphicData uri="http://schemas.openxmlformats.org/drawingml/2006/picture">
+                <pic:pic xmlns:pic="http://schemas.openxmlformats.org/drawingml/2006/picture">
+                  <pic:nvPicPr>
+                    <pic:cNvPr id="1919488689" name=""/>
+                    <pic:cNvPicPr/>
+                  </pic:nvPicPr>
+                  <pic:blipFill>
+                    <a:blip r:embed="rId34"/>
+                    <a:stretch>
+                      <a:fillRect/>
+                    </a:stretch>
+                  </pic:blipFill>
+                  <pic:spPr>
+                    <a:xfrm>
+                      <a:off x="0" y="0"/>
+                      <a:ext cx="5621612" cy="4518417"/>
+                    </a:xfrm>
+                    <a:prstGeom prst="rect">
+                      <a:avLst/>
+                    </a:prstGeom>
+                  </pic:spPr>
+                </pic:pic>
+              </a:graphicData>
+            </a:graphic>
+          </wp:inline>
+        </w:drawing>
+      </w:r>
+    </w:p>
+    <w:p>
+      <w:pPr>
+        <w:jc w:val="left"/>
+        <w:rPr>
+          <w:sz w:val="28"/>
+          <w:szCs w:val="28"/>
         </w:rPr>
       </w:pPr>
     </w:p>
@@ -4427,7 +5842,7 @@
 </file>
 
 <file path=word/numbering.xml><?xml version="1.0" encoding="utf-8"?>
-<w:numbering xmlns:wpc="http://schemas.microsoft.com/office/word/2010/wordprocessingCanvas" xmlns:cx="http://schemas.microsoft.com/office/drawing/2014/chartex" xmlns:cx1="http://schemas.microsoft.com/office/drawing/2015/9/8/chartex" xmlns:cx2="http://schemas.microsoft.com/office/drawing/2015/10/21/chartex" xmlns:cx3="http://schemas.microsoft.com/office/drawing/2016/5/9/chartex" xmlns:cx4="http://schemas.microsoft.com/office/drawing/2016/5/10/chartex" xmlns:cx5="http://schemas.microsoft.com/office/drawing/2016/5/11/chartex" xmlns:cx6="http://schemas.microsoft.com/office/drawing/2016/5/12/chartex" xmlns:cx7="http://schemas.microsoft.com/office/drawing/2016/5/13/chartex" xmlns:cx8="http://schemas.microsoft.com/office/drawing/2016/5/14/chartex" xmlns:mc="http://schemas.openxmlformats.org/markup-compatibility/2006" xmlns:aink="http://schemas.microsoft.com/office/drawing/2016/ink" xmlns:am3d="http://schemas.microsoft.com/office/drawing/2017/model3d" xmlns:o="urn:schemas-microsoft-com:office:office" xmlns:oel="http://schemas.microsoft.com/office/2019/extlst" xmlns:r="http://schemas.openxmlformats.org/officeDocument/2006/relationships" xmlns:m="http://schemas.openxmlformats.org/officeDocument/2006/math" xmlns:v="urn:schemas-microsoft-com:vml" xmlns:wp14="http://schemas.microsoft.com/office/word/2010/wordprocessingDrawing" xmlns:wp="http://schemas.openxmlformats.org/drawingml/2006/wordprocessingDrawing" xmlns:w10="urn:schemas-microsoft-com:office:word" xmlns:w="http://schemas.openxmlformats.org/wordprocessingml/2006/main" xmlns:w14="http://schemas.microsoft.com/office/word/2010/wordml" xmlns:w15="http://schemas.microsoft.com/office/word/2012/wordml" xmlns:w16cei="http://schemas.microsoft.com/office/word/2026/wordml/cei" xmlns:w16cex="http://schemas.microsoft.com/office/word/2018/wordml/cex" xmlns:w16cid="http://schemas.microsoft.com/office/word/2016/wordml/cid" xmlns:w16="http://schemas.microsoft.com/office/word/2018/wordml" xmlns:w16du="http://schemas.microsoft.com/office/word/2023/wordml/word16du" xmlns:w16sdtdh="http://schemas.microsoft.com/office/word/2020/wordml/sdtdatahash" xmlns:w16sdtfl="http://schemas.microsoft.com/office/word/2024/wordml/sdtformatlock" xmlns:w16se="http://schemas.microsoft.com/office/word/2015/wordml/symex" xmlns:wpg="http://schemas.microsoft.com/office/word/2010/wordprocessingGroup" xmlns:wpi="http://schemas.microsoft.com/office/word/2010/wordprocessingInk" xmlns:wne="http://schemas.microsoft.com/office/word/2006/wordml" xmlns:wps="http://schemas.microsoft.com/office/word/2010/wordprocessingShape" mc:Ignorable="w14 w15 w16se w16cid w16 w16cex w16sdtdh w16sdtfl w16du wp14">
+<w:numbering xmlns:wpc="http://schemas.microsoft.com/office/word/2010/wordprocessingCanvas" xmlns:cx="http://schemas.microsoft.com/office/drawing/2014/chartex" xmlns:cx1="http://schemas.microsoft.com/office/drawing/2015/9/8/chartex" xmlns:cx2="http://schemas.microsoft.com/office/drawing/2015/10/21/chartex" xmlns:cx3="http://schemas.microsoft.com/office/drawing/2016/5/9/chartex" xmlns:cx4="http://schemas.microsoft.com/office/drawing/2016/5/10/chartex" xmlns:cx5="http://schemas.microsoft.com/office/drawing/2016/5/11/chartex" xmlns:cx6="http://schemas.microsoft.com/office/drawing/2016/5/12/chartex" xmlns:cx7="http://schemas.microsoft.com/office/drawing/2016/5/13/chartex" xmlns:cx8="http://schemas.microsoft.com/office/drawing/2016/5/14/chartex" xmlns:mc="http://schemas.openxmlformats.org/markup-compatibility/2006" xmlns:aink="http://schemas.microsoft.com/office/drawing/2016/ink" xmlns:am3d="http://schemas.microsoft.com/office/drawing/2017/model3d" xmlns:o="urn:schemas-microsoft-com:office:office" xmlns:oel="http://schemas.microsoft.com/office/2019/extlst" xmlns:r="http://schemas.openxmlformats.org/officeDocument/2006/relationships" xmlns:m="http://schemas.openxmlformats.org/officeDocument/2006/math" xmlns:v="urn:schemas-microsoft-com:vml" xmlns:wp14="http://schemas.microsoft.com/office/word/2010/wordprocessingDrawing" xmlns:wp="http://schemas.openxmlformats.org/drawingml/2006/wordprocessingDrawing" xmlns:w10="urn:schemas-microsoft-com:office:word" xmlns:w="http://schemas.openxmlformats.org/wordprocessingml/2006/main" xmlns:w14="http://schemas.microsoft.com/office/word/2010/wordml" xmlns:w15="http://schemas.microsoft.com/office/word/2012/wordml" xmlns:w16cex="http://schemas.microsoft.com/office/word/2018/wordml/cex" xmlns:w16cid="http://schemas.microsoft.com/office/word/2016/wordml/cid" xmlns:w16="http://schemas.microsoft.com/office/word/2018/wordml" xmlns:w16du="http://schemas.microsoft.com/office/word/2023/wordml/word16du" xmlns:w16sdtdh="http://schemas.microsoft.com/office/word/2020/wordml/sdtdatahash" xmlns:w16se="http://schemas.microsoft.com/office/word/2015/wordml/symex" xmlns:wpg="http://schemas.microsoft.com/office/word/2010/wordprocessingGroup" xmlns:wpi="http://schemas.microsoft.com/office/word/2010/wordprocessingInk" xmlns:wne="http://schemas.microsoft.com/office/word/2006/wordml" xmlns:wps="http://schemas.microsoft.com/office/word/2010/wordprocessingShape" mc:Ignorable="w14 w15 w16se w16cid w16 w16cex w16sdtdh w16du wp14">
   <w:abstractNum w:abstractNumId="0" w15:restartNumberingAfterBreak="0">
     <w:nsid w:val="48693775"/>
     <w:multiLevelType w:val="multilevel"/>
@@ -4548,7 +5963,7 @@
 </file>
 
 <file path=word/styles.xml><?xml version="1.0" encoding="utf-8"?>
-<w:styles xmlns:mc="http://schemas.openxmlformats.org/markup-compatibility/2006" xmlns:r="http://schemas.openxmlformats.org/officeDocument/2006/relationships" xmlns:w="http://schemas.openxmlformats.org/wordprocessingml/2006/main" xmlns:w14="http://schemas.microsoft.com/office/word/2010/wordml" xmlns:w15="http://schemas.microsoft.com/office/word/2012/wordml" xmlns:w16cex="http://schemas.microsoft.com/office/word/2018/wordml/cex" xmlns:w16cid="http://schemas.microsoft.com/office/word/2016/wordml/cid" xmlns:w16="http://schemas.microsoft.com/office/word/2018/wordml" xmlns:w16du="http://schemas.microsoft.com/office/word/2023/wordml/word16du" xmlns:w16sdtdh="http://schemas.microsoft.com/office/word/2020/wordml/sdtdatahash" xmlns:w16sdtfl="http://schemas.microsoft.com/office/word/2024/wordml/sdtformatlock" xmlns:w16se="http://schemas.microsoft.com/office/word/2015/wordml/symex" mc:Ignorable="w14 w15 w16se w16cid w16 w16cex w16sdtdh w16sdtfl w16du">
+<w:styles xmlns:mc="http://schemas.openxmlformats.org/markup-compatibility/2006" xmlns:r="http://schemas.openxmlformats.org/officeDocument/2006/relationships" xmlns:w="http://schemas.openxmlformats.org/wordprocessingml/2006/main" xmlns:w14="http://schemas.microsoft.com/office/word/2010/wordml" xmlns:w15="http://schemas.microsoft.com/office/word/2012/wordml" xmlns:w16cex="http://schemas.microsoft.com/office/word/2018/wordml/cex" xmlns:w16cid="http://schemas.microsoft.com/office/word/2016/wordml/cid" xmlns:w16="http://schemas.microsoft.com/office/word/2018/wordml" xmlns:w16du="http://schemas.microsoft.com/office/word/2023/wordml/word16du" xmlns:w16sdtdh="http://schemas.microsoft.com/office/word/2020/wordml/sdtdatahash" xmlns:w16se="http://schemas.microsoft.com/office/word/2015/wordml/symex" mc:Ignorable="w14 w15 w16se w16cid w16 w16cex w16sdtdh w16du">
   <w:docDefaults>
     <w:rPrDefault>
       <w:rPr>
@@ -4947,7 +6362,7 @@
   <w:style w:type="paragraph" w:default="1" w:styleId="Normal">
     <w:name w:val="Normal"/>
     <w:qFormat/>
-    <w:rsid w:val="00304FC0"/>
+    <w:rsid w:val="00A9408F"/>
     <w:pPr>
       <w:spacing w:after="120" w:line="324" w:lineRule="auto"/>
       <w:jc w:val="both"/>
@@ -5186,11 +6601,34 @@
     <w:name w:val="Hyperlink"/>
     <w:basedOn w:val="DefaultParagraphFont"/>
     <w:uiPriority w:val="99"/>
-    <w:semiHidden/>
     <w:unhideWhenUsed/>
     <w:rsid w:val="00F370A6"/>
     <w:rPr>
       <w:color w:val="0000FF"/>
+      <w:u w:val="single"/>
+    </w:rPr>
+  </w:style>
+  <w:style w:type="character" w:styleId="UnresolvedMention">
+    <w:name w:val="Unresolved Mention"/>
+    <w:basedOn w:val="DefaultParagraphFont"/>
+    <w:uiPriority w:val="99"/>
+    <w:semiHidden/>
+    <w:unhideWhenUsed/>
+    <w:rsid w:val="00D7612D"/>
+    <w:rPr>
+      <w:color w:val="605E5C"/>
+      <w:shd w:val="clear" w:color="auto" w:fill="E1DFDD"/>
+    </w:rPr>
+  </w:style>
+  <w:style w:type="character" w:styleId="FollowedHyperlink">
+    <w:name w:val="FollowedHyperlink"/>
+    <w:basedOn w:val="DefaultParagraphFont"/>
+    <w:uiPriority w:val="99"/>
+    <w:semiHidden/>
+    <w:unhideWhenUsed/>
+    <w:rsid w:val="00D7612D"/>
+    <w:rPr>
+      <w:color w:val="954F72" w:themeColor="followedHyperlink"/>
       <w:u w:val="single"/>
     </w:rPr>
   </w:style>

</xml_diff>